<commit_message>
Fecha de la clase: martes 06-10-2026 en el acta y el Sprint Backlog
Co-Authored-By: Claude Sonnet 5.5 <noreply@anthropic.com>
</commit_message>
<xml_diff>
--- a/Fase 2/Evidencias Proyecto/Evidencias de documentación/Archivos Word/00_Acta_de_Inicio_del_Proyecto.docx
+++ b/Fase 2/Evidencias Proyecto/Evidencias de documentación/Archivos Word/00_Acta_de_Inicio_del_Proyecto.docx
@@ -2436,7 +2436,7 @@
               <w:rPr>
                 <w:sz w:val="18"/>
               </w:rPr>
-              <w:t>05-10-2026</w:t>
+              <w:t>06-10-2026</w:t>
             </w:r>
           </w:p>
         </w:tc>
@@ -4882,7 +4882,7 @@
               <w:rPr>
                 <w:sz w:val="17"/>
               </w:rPr>
-              <w:t>Plan por entrega con fechas (05-10 y 06-10) y entregables mínimos suficientes</w:t>
+              <w:t>Plan por entrega con fechas (clase y Fase 1, 06-10) y entregables mínimos suficientes</w:t>
             </w:r>
           </w:p>
         </w:tc>

</xml_diff>